<commit_message>
Remove suggested reviewers from cover letter
</commit_message>
<xml_diff>
--- a/submission/cover_letter.docx
+++ b/submission/cover_letter.docx
@@ -53,40 +53,6 @@
       </w:pPr>
       <w:r>
         <w:t>This manuscript is original, has not been published previously, and is not under consideration elsewhere. All authors have approved the submission.</w:t>
-      </w:r>
-    </w:p>
-    <w:p/>
-    <w:p>
-      <w:pPr>
-        <w:spacing w:after="120"/>
-      </w:pPr>
-      <w:r>
-        <w:t>We suggest the following experts as potential reviewers:</w:t>
-      </w:r>
-    </w:p>
-    <w:p/>
-    <w:p>
-      <w:pPr>
-        <w:spacing w:after="120"/>
-      </w:pPr>
-      <w:r>
-        <w:t>1. [Reviewer 1 name and institution — optional]</w:t>
-      </w:r>
-    </w:p>
-    <w:p>
-      <w:pPr>
-        <w:spacing w:after="120"/>
-      </w:pPr>
-      <w:r>
-        <w:t>2. [Reviewer 2 name and institution — optional]</w:t>
-      </w:r>
-    </w:p>
-    <w:p>
-      <w:pPr>
-        <w:spacing w:after="120"/>
-      </w:pPr>
-      <w:r>
-        <w:t>3. [Reviewer 3 name and institution — optional]</w:t>
       </w:r>
     </w:p>
     <w:p/>

</xml_diff>